<commit_message>
fix: little bug with words
</commit_message>
<xml_diff>
--- a/finalexam/teacher/202502index.docx
+++ b/finalexam/teacher/202502index.docx
@@ -633,7 +633,6 @@
         </w:rPr>
         <w:t xml:space="preserve"> </w:t>
       </w:r>
-      <w:proofErr w:type="gramStart"/>
       <w:r>
         <w:rPr>
           <w:rFonts w:ascii="Arial" w:hAnsi="Arial" w:hint="eastAsia"/>
@@ -641,17 +640,7 @@
           <w:bCs/>
           <w:color w:val="000000"/>
         </w:rPr>
-        <w:t>奈魁斯</w:t>
-      </w:r>
-      <w:proofErr w:type="gramEnd"/>
-      <w:r>
-        <w:rPr>
-          <w:rFonts w:ascii="Arial" w:hAnsi="Arial" w:hint="eastAsia"/>
-          <w:b/>
-          <w:bCs/>
-          <w:color w:val="000000"/>
-        </w:rPr>
-        <w:t>特</w:t>
+        <w:t>奈魁斯特</w:t>
       </w:r>
     </w:p>
     <w:p>
@@ -710,16 +699,8 @@
         <w:rPr>
           <w:rFonts w:hint="eastAsia"/>
         </w:rPr>
-        <w:t>=</w:t>
-      </w:r>
-      <w:proofErr w:type="spellStart"/>
-      <w:r>
-        <w:rPr>
-          <w:rFonts w:hint="eastAsia"/>
-        </w:rPr>
-        <w:t>WBaud</w:t>
-      </w:r>
-      <w:proofErr w:type="spellEnd"/>
+        <w:t>=WBaud</w:t>
+      </w:r>
     </w:p>
     <w:p>
       <w:r>
@@ -826,19 +807,8 @@
           <w:bCs/>
           <w:color w:val="000000"/>
         </w:rPr>
-        <w:t xml:space="preserve">        C= </w:t>
-      </w:r>
-      <w:proofErr w:type="spellStart"/>
-      <w:r>
-        <w:rPr>
-          <w:rFonts w:ascii="Arial" w:hAnsi="Arial" w:cs="Arial"/>
-          <w:b/>
-          <w:bCs/>
-          <w:color w:val="000000"/>
-        </w:rPr>
-        <w:t>Hlog</w:t>
-      </w:r>
-      <w:proofErr w:type="spellEnd"/>
+        <w:t xml:space="preserve">        C= Hlog</w:t>
+      </w:r>
       <w:r>
         <w:rPr>
           <w:rFonts w:ascii="Arial" w:hAnsi="Arial" w:cs="Arial"/>
@@ -953,7 +923,6 @@
         </w:rPr>
         <w:t>分贝（</w:t>
       </w:r>
-      <w:proofErr w:type="spellStart"/>
       <w:r>
         <w:rPr>
           <w:rFonts w:ascii="Arial" w:hAnsi="Arial" w:cs="Arial"/>
@@ -966,7 +935,6 @@
         </w:rPr>
         <w:t>db</w:t>
       </w:r>
-      <w:proofErr w:type="spellEnd"/>
       <w:r>
         <w:rPr>
           <w:rFonts w:ascii="Arial" w:hAnsi="Arial" w:hint="eastAsia"/>
@@ -2488,21 +2456,7 @@
         <w:rPr>
           <w:rFonts w:hint="eastAsia"/>
         </w:rPr>
-        <w:t>套接</w:t>
-      </w:r>
-      <w:proofErr w:type="gramStart"/>
-      <w:r>
-        <w:rPr>
-          <w:rFonts w:hint="eastAsia"/>
-        </w:rPr>
-        <w:t>字系统</w:t>
-      </w:r>
-      <w:proofErr w:type="gramEnd"/>
-      <w:r>
-        <w:rPr>
-          <w:rFonts w:hint="eastAsia"/>
-        </w:rPr>
-        <w:t>调用过程</w:t>
+        <w:t>套接字系统调用过程</w:t>
       </w:r>
       <w:r>
         <w:rPr>
@@ -3137,21 +3091,7 @@
         <w:rPr>
           <w:rFonts w:hint="eastAsia"/>
         </w:rPr>
-        <w:t>公</w:t>
-      </w:r>
-      <w:proofErr w:type="gramStart"/>
-      <w:r>
-        <w:rPr>
-          <w:rFonts w:hint="eastAsia"/>
-        </w:rPr>
-        <w:t>钥</w:t>
-      </w:r>
-      <w:proofErr w:type="gramEnd"/>
-      <w:r>
-        <w:rPr>
-          <w:rFonts w:hint="eastAsia"/>
-        </w:rPr>
-        <w:t>的签发与认证</w:t>
+        <w:t>公钥的签发与认证</w:t>
       </w:r>
     </w:p>
     <w:p>
@@ -3528,7 +3468,7 @@
           <v:shape id="_x0000_i1025" type="#_x0000_t75" style="width:420.75pt;height:202.5pt" o:ole="">
             <v:imagedata r:id="rId4" o:title=""/>
           </v:shape>
-          <o:OLEObject Type="Embed" ProgID="PBrush" ShapeID="_x0000_i1025" DrawAspect="Content" ObjectID="_1844174354" r:id="rId5"/>
+          <o:OLEObject Type="Embed" ProgID="PBrush" ShapeID="_x0000_i1025" DrawAspect="Content" ObjectID="_1844243183" r:id="rId5"/>
         </w:object>
       </w:r>
       <w:r>
@@ -5107,9 +5047,9 @@
         <w:tblLook w:val="01E0" w:firstRow="1" w:lastRow="1" w:firstColumn="1" w:lastColumn="1" w:noHBand="0" w:noVBand="0"/>
       </w:tblPr>
       <w:tblGrid>
-        <w:gridCol w:w="1785"/>
-        <w:gridCol w:w="2754"/>
-        <w:gridCol w:w="2749"/>
+        <w:gridCol w:w="1786"/>
+        <w:gridCol w:w="2756"/>
+        <w:gridCol w:w="2746"/>
       </w:tblGrid>
       <w:tr>
         <w:tc>
@@ -5342,7 +5282,7 @@
                 <w:b/>
                 <w:bCs/>
               </w:rPr>
-              <w:t>1923.168.2.1</w:t>
+              <w:t>192.168.2.1</w:t>
             </w:r>
           </w:p>
         </w:tc>
@@ -5926,11 +5866,6 @@
     <w:p/>
     <w:p/>
     <w:p>
-      <w:pPr>
-        <w:rPr>
-          <w:rFonts w:hint="eastAsia"/>
-        </w:rPr>
-      </w:pPr>
       <w:r>
         <w:rPr>
           <w:rFonts w:hint="eastAsia"/>

</xml_diff>